<commit_message>
team 4: small update
</commit_message>
<xml_diff>
--- a/03_Team_Work/Team4/Milestone_3_Components/Ready/CS_M3_Team4_ProfileAuditLoggerEITable_v02.docx
+++ b/03_Team_Work/Team4/Milestone_3_Components/Ready/CS_M3_Team4_ProfileAuditLoggerEITable_v02.docx
@@ -336,7 +336,7 @@
         <w:tc>
           <w:tcPr>
             <w:tcW w:w="1525" w:type="dxa"/>
-            <w:shd w:val="clear" w:color="auto" w:fill="D9D9D9" w:themeFill="background1" w:themeFillShade="D9"/>
+            <w:shd w:val="clear" w:color="auto" w:fill="CCCCCC"/>
           </w:tcPr>
           <w:p>
             <w:pPr>
@@ -363,7 +363,7 @@
         <w:tc>
           <w:tcPr>
             <w:tcW w:w="1980" w:type="dxa"/>
-            <w:shd w:val="clear" w:color="auto" w:fill="D9D9D9" w:themeFill="background1" w:themeFillShade="D9"/>
+            <w:shd w:val="clear" w:color="auto" w:fill="CCCCCC"/>
           </w:tcPr>
           <w:p>
             <w:pPr>
@@ -386,7 +386,7 @@
         <w:tc>
           <w:tcPr>
             <w:tcW w:w="1170" w:type="dxa"/>
-            <w:shd w:val="clear" w:color="auto" w:fill="D9D9D9" w:themeFill="background1" w:themeFillShade="D9"/>
+            <w:shd w:val="clear" w:color="auto" w:fill="CCCCCC"/>
           </w:tcPr>
           <w:p>
             <w:pPr>
@@ -409,7 +409,7 @@
         <w:tc>
           <w:tcPr>
             <w:tcW w:w="2250" w:type="dxa"/>
-            <w:shd w:val="clear" w:color="auto" w:fill="D9D9D9" w:themeFill="background1" w:themeFillShade="D9"/>
+            <w:shd w:val="clear" w:color="auto" w:fill="CCCCCC"/>
           </w:tcPr>
           <w:p>
             <w:pPr>
@@ -432,7 +432,7 @@
         <w:tc>
           <w:tcPr>
             <w:tcW w:w="900" w:type="dxa"/>
-            <w:shd w:val="clear" w:color="auto" w:fill="D9D9D9" w:themeFill="background1" w:themeFillShade="D9"/>
+            <w:shd w:val="clear" w:color="auto" w:fill="CCCCCC"/>
           </w:tcPr>
           <w:p>
             <w:pPr>
@@ -455,7 +455,7 @@
         <w:tc>
           <w:tcPr>
             <w:tcW w:w="1761" w:type="dxa"/>
-            <w:shd w:val="clear" w:color="auto" w:fill="D9D9D9" w:themeFill="background1" w:themeFillShade="D9"/>
+            <w:shd w:val="clear" w:color="auto" w:fill="CCCCCC"/>
           </w:tcPr>
           <w:p>
             <w:pPr>
@@ -640,7 +640,7 @@
         <w:tc>
           <w:tcPr>
             <w:tcW w:w="1525" w:type="dxa"/>
-            <w:shd w:val="clear" w:color="auto" w:fill="D9D9D9" w:themeFill="background1" w:themeFillShade="D9"/>
+            <w:shd w:val="clear" w:color="auto" w:fill="CCCCCC"/>
           </w:tcPr>
           <w:p>
             <w:pPr>
@@ -667,7 +667,7 @@
         <w:tc>
           <w:tcPr>
             <w:tcW w:w="1980" w:type="dxa"/>
-            <w:shd w:val="clear" w:color="auto" w:fill="D9D9D9" w:themeFill="background1" w:themeFillShade="D9"/>
+            <w:shd w:val="clear" w:color="auto" w:fill="CCCCCC"/>
           </w:tcPr>
           <w:p>
             <w:pPr>
@@ -690,7 +690,7 @@
         <w:tc>
           <w:tcPr>
             <w:tcW w:w="1170" w:type="dxa"/>
-            <w:shd w:val="clear" w:color="auto" w:fill="D9D9D9" w:themeFill="background1" w:themeFillShade="D9"/>
+            <w:shd w:val="clear" w:color="auto" w:fill="CCCCCC"/>
           </w:tcPr>
           <w:p>
             <w:pPr>
@@ -713,7 +713,7 @@
         <w:tc>
           <w:tcPr>
             <w:tcW w:w="2250" w:type="dxa"/>
-            <w:shd w:val="clear" w:color="auto" w:fill="D9D9D9" w:themeFill="background1" w:themeFillShade="D9"/>
+            <w:shd w:val="clear" w:color="auto" w:fill="CCCCCC"/>
           </w:tcPr>
           <w:p>
             <w:pPr>
@@ -736,7 +736,7 @@
         <w:tc>
           <w:tcPr>
             <w:tcW w:w="900" w:type="dxa"/>
-            <w:shd w:val="clear" w:color="auto" w:fill="D9D9D9" w:themeFill="background1" w:themeFillShade="D9"/>
+            <w:shd w:val="clear" w:color="auto" w:fill="CCCCCC"/>
           </w:tcPr>
           <w:p>
             <w:pPr>
@@ -759,7 +759,7 @@
         <w:tc>
           <w:tcPr>
             <w:tcW w:w="1761" w:type="dxa"/>
-            <w:shd w:val="clear" w:color="auto" w:fill="D9D9D9" w:themeFill="background1" w:themeFillShade="D9"/>
+            <w:shd w:val="clear" w:color="auto" w:fill="CCCCCC"/>
           </w:tcPr>
           <w:p>
             <w:pPr>
@@ -944,7 +944,7 @@
         <w:tc>
           <w:tcPr>
             <w:tcW w:w="1525" w:type="dxa"/>
-            <w:shd w:val="clear" w:color="auto" w:fill="D9D9D9" w:themeFill="background1" w:themeFillShade="D9"/>
+            <w:shd w:val="clear" w:color="auto" w:fill="CCCCCC"/>
           </w:tcPr>
           <w:p>
             <w:pPr>
@@ -971,7 +971,7 @@
         <w:tc>
           <w:tcPr>
             <w:tcW w:w="1980" w:type="dxa"/>
-            <w:shd w:val="clear" w:color="auto" w:fill="D9D9D9" w:themeFill="background1" w:themeFillShade="D9"/>
+            <w:shd w:val="clear" w:color="auto" w:fill="CCCCCC"/>
           </w:tcPr>
           <w:p>
             <w:pPr>
@@ -994,7 +994,7 @@
         <w:tc>
           <w:tcPr>
             <w:tcW w:w="1170" w:type="dxa"/>
-            <w:shd w:val="clear" w:color="auto" w:fill="D9D9D9" w:themeFill="background1" w:themeFillShade="D9"/>
+            <w:shd w:val="clear" w:color="auto" w:fill="CCCCCC"/>
           </w:tcPr>
           <w:p>
             <w:pPr>
@@ -1017,7 +1017,7 @@
         <w:tc>
           <w:tcPr>
             <w:tcW w:w="2250" w:type="dxa"/>
-            <w:shd w:val="clear" w:color="auto" w:fill="D9D9D9" w:themeFill="background1" w:themeFillShade="D9"/>
+            <w:shd w:val="clear" w:color="auto" w:fill="CCCCCC"/>
           </w:tcPr>
           <w:p>
             <w:pPr>
@@ -1040,7 +1040,7 @@
         <w:tc>
           <w:tcPr>
             <w:tcW w:w="900" w:type="dxa"/>
-            <w:shd w:val="clear" w:color="auto" w:fill="D9D9D9" w:themeFill="background1" w:themeFillShade="D9"/>
+            <w:shd w:val="clear" w:color="auto" w:fill="CCCCCC"/>
           </w:tcPr>
           <w:p>
             <w:pPr>
@@ -1063,7 +1063,7 @@
         <w:tc>
           <w:tcPr>
             <w:tcW w:w="1761" w:type="dxa"/>
-            <w:shd w:val="clear" w:color="auto" w:fill="D9D9D9" w:themeFill="background1" w:themeFillShade="D9"/>
+            <w:shd w:val="clear" w:color="auto" w:fill="CCCCCC"/>
           </w:tcPr>
           <w:p>
             <w:pPr>

</xml_diff>